<commit_message>
Addressed the review concern.
</commit_message>
<xml_diff>
--- a/Evidence/SessionConfigurationValidationReport.docx
+++ b/Evidence/SessionConfigurationValidationReport.docx
@@ -709,7 +709,6 @@
         <w:t xml:space="preserve">. Debug logging was enabled for </w:t>
       </w:r>
       <w:proofErr w:type="spellStart"/>
-      <w:proofErr w:type="gramStart"/>
       <w:r>
         <w:rPr>
           <w:rFonts w:ascii="Calibri" w:hAnsi="Calibri" w:cs="Calibri"/>
@@ -719,7 +718,6 @@
         <w:t>Microsoft.AspNetCore.Components</w:t>
       </w:r>
       <w:proofErr w:type="spellEnd"/>
-      <w:proofErr w:type="gramEnd"/>
       <w:r>
         <w:rPr>
           <w:rFonts w:ascii="Calibri" w:hAnsi="Calibri" w:cs="Calibri"/>
@@ -781,6 +779,114 @@
           <w:szCs w:val="22"/>
         </w:rPr>
         <w:t>.</w:t>
+      </w:r>
+    </w:p>
+    <w:p>
+      <w:pPr>
+        <w:pStyle w:val="NoSpacing"/>
+        <w:rPr>
+          <w:rFonts w:ascii="Calibri" w:hAnsi="Calibri" w:cs="Calibri"/>
+          <w:sz w:val="22"/>
+          <w:szCs w:val="22"/>
+        </w:rPr>
+      </w:pPr>
+      <w:r>
+        <w:rPr>
+          <w:rFonts w:ascii="Calibri" w:hAnsi="Calibri" w:cs="Calibri"/>
+          <w:b/>
+          <w:bCs/>
+          <w:sz w:val="22"/>
+          <w:szCs w:val="22"/>
+        </w:rPr>
+        <w:t>Documentation Assessment:</w:t>
+      </w:r>
+      <w:r>
+        <w:rPr>
+          <w:rFonts w:ascii="Calibri" w:hAnsi="Calibri" w:cs="Calibri"/>
+          <w:b/>
+          <w:bCs/>
+          <w:sz w:val="22"/>
+          <w:szCs w:val="22"/>
+        </w:rPr>
+        <w:t xml:space="preserve"> </w:t>
+      </w:r>
+      <w:r>
+        <w:rPr>
+          <w:rFonts w:ascii="Calibri" w:hAnsi="Calibri" w:cs="Calibri"/>
+          <w:sz w:val="22"/>
+          <w:szCs w:val="22"/>
+        </w:rPr>
+        <w:t xml:space="preserve">The Blazor documentation explicitly states that session data persistence requires </w:t>
+      </w:r>
+      <w:proofErr w:type="spellStart"/>
+      <w:r>
+        <w:rPr>
+          <w:rFonts w:ascii="Calibri" w:hAnsi="Calibri" w:cs="Calibri"/>
+          <w:sz w:val="22"/>
+          <w:szCs w:val="22"/>
+        </w:rPr>
+        <w:t>AddSession</w:t>
+      </w:r>
+      <w:proofErr w:type="spellEnd"/>
+      <w:r>
+        <w:rPr>
+          <w:rFonts w:ascii="Calibri" w:hAnsi="Calibri" w:cs="Calibri"/>
+          <w:sz w:val="22"/>
+          <w:szCs w:val="22"/>
+        </w:rPr>
+        <w:t xml:space="preserve"> and </w:t>
+      </w:r>
+      <w:proofErr w:type="spellStart"/>
+      <w:r>
+        <w:rPr>
+          <w:rFonts w:ascii="Calibri" w:hAnsi="Calibri" w:cs="Calibri"/>
+          <w:sz w:val="22"/>
+          <w:szCs w:val="22"/>
+        </w:rPr>
+        <w:t>UseSession</w:t>
+      </w:r>
+      <w:proofErr w:type="spellEnd"/>
+      <w:r>
+        <w:rPr>
+          <w:rFonts w:ascii="Calibri" w:hAnsi="Calibri" w:cs="Calibri"/>
+          <w:sz w:val="22"/>
+          <w:szCs w:val="22"/>
+        </w:rPr>
+        <w:t xml:space="preserve">, and its example registers </w:t>
+      </w:r>
+      <w:proofErr w:type="spellStart"/>
+      <w:r>
+        <w:rPr>
+          <w:rFonts w:ascii="Calibri" w:hAnsi="Calibri" w:cs="Calibri"/>
+          <w:sz w:val="22"/>
+          <w:szCs w:val="22"/>
+        </w:rPr>
+        <w:t>AddDistributedMemoryCache</w:t>
+      </w:r>
+      <w:proofErr w:type="spellEnd"/>
+      <w:r>
+        <w:rPr>
+          <w:rFonts w:ascii="Calibri" w:hAnsi="Calibri" w:cs="Calibri"/>
+          <w:sz w:val="22"/>
+          <w:szCs w:val="22"/>
+        </w:rPr>
+        <w:t xml:space="preserve">. It therefore documents rather than merely </w:t>
+      </w:r>
+      <w:r>
+        <w:rPr>
+          <w:rFonts w:ascii="Calibri" w:hAnsi="Calibri" w:cs="Calibri"/>
+          <w:sz w:val="22"/>
+          <w:szCs w:val="22"/>
+        </w:rPr>
+        <w:t>assume</w:t>
+      </w:r>
+      <w:r>
+        <w:rPr>
+          <w:rFonts w:ascii="Calibri" w:hAnsi="Calibri" w:cs="Calibri"/>
+          <w:sz w:val="22"/>
+          <w:szCs w:val="22"/>
+        </w:rPr>
+        <w:t xml:space="preserve"> the session requirements.</w:t>
       </w:r>
     </w:p>
     <w:p>
@@ -1333,6 +1439,7 @@
                 <w:sz w:val="22"/>
                 <w:szCs w:val="22"/>
               </w:rPr>
+              <w:lastRenderedPageBreak/>
               <w:t xml:space="preserve">Omitting </w:t>
             </w:r>
             <w:proofErr w:type="spellStart"/>
@@ -1369,26 +1476,7 @@
                 <w:sz w:val="22"/>
                 <w:szCs w:val="22"/>
               </w:rPr>
-              <w:lastRenderedPageBreak/>
-              <w:t xml:space="preserve">Observed: Both pages returned HTTP 500 before normal page rendering. Both failures surfaced through </w:t>
-            </w:r>
-            <w:proofErr w:type="gramStart"/>
-            <w:r>
-              <w:rPr>
-                <w:rFonts w:ascii="Calibri" w:hAnsi="Calibri" w:cs="Calibri"/>
-                <w:sz w:val="22"/>
-                <w:szCs w:val="22"/>
-              </w:rPr>
-              <w:t>Microsoft.AspNetCore.Diagnostics.DeveloperExceptionPageMiddleware</w:t>
-            </w:r>
-            <w:proofErr w:type="gramEnd"/>
-            <w:r>
-              <w:rPr>
-                <w:rFonts w:ascii="Calibri" w:hAnsi="Calibri" w:cs="Calibri"/>
-                <w:sz w:val="22"/>
-                <w:szCs w:val="22"/>
-              </w:rPr>
-              <w:t>[1] with the same exception:</w:t>
+              <w:t>Observed: Both pages returned HTTP 500 before normal page rendering. Both failures surfaced through Microsoft.AspNetCore.Diagnostics.DeveloperExceptionPageMiddleware[1] with the same exception:</w:t>
             </w:r>
           </w:p>
           <w:p>
@@ -1439,7 +1527,6 @@
                 <w:sz w:val="22"/>
                 <w:szCs w:val="22"/>
               </w:rPr>
-              <w:lastRenderedPageBreak/>
               <w:t>Pass</w:t>
             </w:r>
           </w:p>
@@ -1549,7 +1636,6 @@
                 <w:sz w:val="22"/>
                 <w:szCs w:val="22"/>
               </w:rPr>
-              <w:lastRenderedPageBreak/>
               <w:t xml:space="preserve">Restoring </w:t>
             </w:r>
             <w:proofErr w:type="spellStart"/>
@@ -1769,43 +1855,7 @@
                 <w:sz w:val="22"/>
                 <w:szCs w:val="22"/>
               </w:rPr>
-              <w:t xml:space="preserve">: </w:t>
-            </w:r>
-            <w:proofErr w:type="gramStart"/>
-            <w:r>
-              <w:rPr>
-                <w:rFonts w:ascii="Calibri" w:hAnsi="Calibri" w:cs="Calibri"/>
-                <w:sz w:val="22"/>
-                <w:szCs w:val="22"/>
-              </w:rPr>
-              <w:t>Microsoft.AspNetCore.Components.Endpoints</w:t>
-            </w:r>
-            <w:proofErr w:type="gramEnd"/>
-            <w:r>
-              <w:rPr>
-                <w:rFonts w:ascii="Calibri" w:hAnsi="Calibri" w:cs="Calibri"/>
-                <w:sz w:val="22"/>
-                <w:szCs w:val="22"/>
-              </w:rPr>
-              <w:t>.</w:t>
-            </w:r>
-            <w:proofErr w:type="gramStart"/>
-            <w:r>
-              <w:rPr>
-                <w:rFonts w:ascii="Calibri" w:hAnsi="Calibri" w:cs="Calibri"/>
-                <w:sz w:val="22"/>
-                <w:szCs w:val="22"/>
-              </w:rPr>
-              <w:t>SessionStorageTempDataProvider[</w:t>
-            </w:r>
-            <w:proofErr w:type="gramEnd"/>
-            <w:r>
-              <w:rPr>
-                <w:rFonts w:ascii="Calibri" w:hAnsi="Calibri" w:cs="Calibri"/>
-                <w:sz w:val="22"/>
-                <w:szCs w:val="22"/>
-              </w:rPr>
-              <w:t>1]</w:t>
+              <w:t>: Microsoft.AspNetCore.Components.Endpoints.SessionStorageTempDataProvider[1]</w:t>
             </w:r>
           </w:p>
           <w:p>
@@ -1882,7 +1932,6 @@
               </w:rPr>
             </w:pPr>
             <w:hyperlink r:id="rId24" w:tooltip="idle-expiry" w:history="1">
-              <w:proofErr w:type="gramStart"/>
               <w:r>
                 <w:rPr>
                   <w:rStyle w:val="Hyperlink"/>
@@ -1892,7 +1941,6 @@
                 </w:rPr>
                 <w:t>idle-expiry</w:t>
               </w:r>
-              <w:proofErr w:type="gramEnd"/>
             </w:hyperlink>
           </w:p>
         </w:tc>
@@ -1917,19 +1965,9 @@
                 <w:sz w:val="22"/>
                 <w:szCs w:val="22"/>
               </w:rPr>
-              <w:t xml:space="preserve">Deleting </w:t>
-            </w:r>
-            <w:proofErr w:type="gramStart"/>
-            <w:r>
-              <w:rPr>
-                <w:rFonts w:ascii="Calibri" w:hAnsi="Calibri" w:cs="Calibri"/>
-                <w:sz w:val="22"/>
-                <w:szCs w:val="22"/>
-              </w:rPr>
-              <w:t>the .</w:t>
+              <w:t>Deleting the .</w:t>
             </w:r>
             <w:proofErr w:type="spellStart"/>
-            <w:proofErr w:type="gramEnd"/>
             <w:r>
               <w:rPr>
                 <w:rFonts w:ascii="Calibri" w:hAnsi="Calibri" w:cs="Calibri"/>
@@ -2009,43 +2047,7 @@
                 <w:sz w:val="22"/>
                 <w:szCs w:val="22"/>
               </w:rPr>
-              <w:t xml:space="preserve">: </w:t>
-            </w:r>
-            <w:proofErr w:type="gramStart"/>
-            <w:r>
-              <w:rPr>
-                <w:rFonts w:ascii="Calibri" w:hAnsi="Calibri" w:cs="Calibri"/>
-                <w:sz w:val="22"/>
-                <w:szCs w:val="22"/>
-              </w:rPr>
-              <w:t>Microsoft.AspNetCore.Components.Endpoints</w:t>
-            </w:r>
-            <w:proofErr w:type="gramEnd"/>
-            <w:r>
-              <w:rPr>
-                <w:rFonts w:ascii="Calibri" w:hAnsi="Calibri" w:cs="Calibri"/>
-                <w:sz w:val="22"/>
-                <w:szCs w:val="22"/>
-              </w:rPr>
-              <w:t>.</w:t>
-            </w:r>
-            <w:proofErr w:type="gramStart"/>
-            <w:r>
-              <w:rPr>
-                <w:rFonts w:ascii="Calibri" w:hAnsi="Calibri" w:cs="Calibri"/>
-                <w:sz w:val="22"/>
-                <w:szCs w:val="22"/>
-              </w:rPr>
-              <w:t>SessionStorageTempDataProvider[</w:t>
-            </w:r>
-            <w:proofErr w:type="gramEnd"/>
-            <w:r>
-              <w:rPr>
-                <w:rFonts w:ascii="Calibri" w:hAnsi="Calibri" w:cs="Calibri"/>
-                <w:sz w:val="22"/>
-                <w:szCs w:val="22"/>
-              </w:rPr>
-              <w:t>1]</w:t>
+              <w:t>: Microsoft.AspNetCore.Components.Endpoints.SessionStorageTempDataProvider[1]</w:t>
             </w:r>
           </w:p>
           <w:p>
@@ -2122,7 +2124,6 @@
               </w:rPr>
             </w:pPr>
             <w:hyperlink r:id="rId25" w:tooltip="deleted-cookie" w:history="1">
-              <w:proofErr w:type="gramStart"/>
               <w:r>
                 <w:rPr>
                   <w:rStyle w:val="Hyperlink"/>
@@ -2132,7 +2133,6 @@
                 </w:rPr>
                 <w:t>deleted-cookie</w:t>
               </w:r>
-              <w:proofErr w:type="gramEnd"/>
             </w:hyperlink>
           </w:p>
         </w:tc>
@@ -2193,43 +2193,7 @@
                 <w:sz w:val="22"/>
                 <w:szCs w:val="22"/>
               </w:rPr>
-              <w:t xml:space="preserve">warn: </w:t>
-            </w:r>
-            <w:proofErr w:type="gramStart"/>
-            <w:r>
-              <w:rPr>
-                <w:rFonts w:ascii="Calibri" w:hAnsi="Calibri" w:cs="Calibri"/>
-                <w:sz w:val="22"/>
-                <w:szCs w:val="22"/>
-              </w:rPr>
-              <w:t>Microsoft.AspNetCore.Components.Endpoints</w:t>
-            </w:r>
-            <w:proofErr w:type="gramEnd"/>
-            <w:r>
-              <w:rPr>
-                <w:rFonts w:ascii="Calibri" w:hAnsi="Calibri" w:cs="Calibri"/>
-                <w:sz w:val="22"/>
-                <w:szCs w:val="22"/>
-              </w:rPr>
-              <w:t>.</w:t>
-            </w:r>
-            <w:proofErr w:type="gramStart"/>
-            <w:r>
-              <w:rPr>
-                <w:rFonts w:ascii="Calibri" w:hAnsi="Calibri" w:cs="Calibri"/>
-                <w:sz w:val="22"/>
-                <w:szCs w:val="22"/>
-              </w:rPr>
-              <w:t>SessionCascadingValueSupplier[</w:t>
-            </w:r>
-            <w:proofErr w:type="gramEnd"/>
-            <w:r>
-              <w:rPr>
-                <w:rFonts w:ascii="Calibri" w:hAnsi="Calibri" w:cs="Calibri"/>
-                <w:sz w:val="22"/>
-                <w:szCs w:val="22"/>
-              </w:rPr>
-              <w:t>2]</w:t>
+              <w:t>warn: Microsoft.AspNetCore.Components.Endpoints.SessionCascadingValueSupplier[2]</w:t>
             </w:r>
           </w:p>
           <w:p>
@@ -2250,7 +2214,6 @@
               <w:t xml:space="preserve">    </w:t>
             </w:r>
             <w:proofErr w:type="spellStart"/>
-            <w:proofErr w:type="gramStart"/>
             <w:r>
               <w:rPr>
                 <w:rFonts w:ascii="Calibri" w:hAnsi="Calibri" w:cs="Calibri"/>
@@ -2260,7 +2223,6 @@
               <w:t>System.Text.Json.JsonException</w:t>
             </w:r>
             <w:proofErr w:type="spellEnd"/>
-            <w:proofErr w:type="gramEnd"/>
             <w:r>
               <w:rPr>
                 <w:rFonts w:ascii="Calibri" w:hAnsi="Calibri" w:cs="Calibri"/>
@@ -2481,6 +2443,7 @@
                 <w:sz w:val="22"/>
                 <w:szCs w:val="22"/>
               </w:rPr>
+              <w:lastRenderedPageBreak/>
               <w:t xml:space="preserve">Injecting corrupt bytes into the </w:t>
             </w:r>
             <w:proofErr w:type="spellStart"/>
@@ -2535,44 +2498,7 @@
                 <w:sz w:val="22"/>
                 <w:szCs w:val="22"/>
               </w:rPr>
-              <w:lastRenderedPageBreak/>
-              <w:t xml:space="preserve">warn: </w:t>
-            </w:r>
-            <w:proofErr w:type="gramStart"/>
-            <w:r>
-              <w:rPr>
-                <w:rFonts w:ascii="Calibri" w:hAnsi="Calibri" w:cs="Calibri"/>
-                <w:sz w:val="22"/>
-                <w:szCs w:val="22"/>
-              </w:rPr>
-              <w:t>Microsoft.AspNetCore.Components.Endpoints</w:t>
-            </w:r>
-            <w:proofErr w:type="gramEnd"/>
-            <w:r>
-              <w:rPr>
-                <w:rFonts w:ascii="Calibri" w:hAnsi="Calibri" w:cs="Calibri"/>
-                <w:sz w:val="22"/>
-                <w:szCs w:val="22"/>
-              </w:rPr>
-              <w:t>.</w:t>
-            </w:r>
-            <w:proofErr w:type="gramStart"/>
-            <w:r>
-              <w:rPr>
-                <w:rFonts w:ascii="Calibri" w:hAnsi="Calibri" w:cs="Calibri"/>
-                <w:sz w:val="22"/>
-                <w:szCs w:val="22"/>
-              </w:rPr>
-              <w:t>SessionStorageTempDataProvider[</w:t>
-            </w:r>
-            <w:proofErr w:type="gramEnd"/>
-            <w:r>
-              <w:rPr>
-                <w:rFonts w:ascii="Calibri" w:hAnsi="Calibri" w:cs="Calibri"/>
-                <w:sz w:val="22"/>
-                <w:szCs w:val="22"/>
-              </w:rPr>
-              <w:t>2]</w:t>
+              <w:t>warn: Microsoft.AspNetCore.Components.Endpoints.SessionStorageTempDataProvider[2]</w:t>
             </w:r>
           </w:p>
           <w:p>
@@ -2593,7 +2519,6 @@
               <w:t xml:space="preserve">    </w:t>
             </w:r>
             <w:proofErr w:type="spellStart"/>
-            <w:proofErr w:type="gramStart"/>
             <w:r>
               <w:rPr>
                 <w:rFonts w:ascii="Calibri" w:hAnsi="Calibri" w:cs="Calibri"/>
@@ -2603,7 +2528,6 @@
               <w:t>System.Text.Json.JsonException</w:t>
             </w:r>
             <w:proofErr w:type="spellEnd"/>
-            <w:proofErr w:type="gramEnd"/>
             <w:r>
               <w:rPr>
                 <w:rFonts w:ascii="Calibri" w:hAnsi="Calibri" w:cs="Calibri"/>
@@ -2669,7 +2593,6 @@
                 <w:sz w:val="22"/>
                 <w:szCs w:val="22"/>
               </w:rPr>
-              <w:lastRenderedPageBreak/>
               <w:t>Pass</w:t>
             </w:r>
           </w:p>
@@ -2825,7 +2748,6 @@
                 <w:sz w:val="22"/>
                 <w:szCs w:val="22"/>
               </w:rPr>
-              <w:lastRenderedPageBreak/>
               <w:t>Injecting valid JSON with the wrong envelope shape into the session-bound property's actual key produces a logged deserialization failure.</w:t>
             </w:r>
           </w:p>
@@ -2862,43 +2784,7 @@
                 <w:sz w:val="22"/>
                 <w:szCs w:val="22"/>
               </w:rPr>
-              <w:t xml:space="preserve">warn: </w:t>
-            </w:r>
-            <w:proofErr w:type="gramStart"/>
-            <w:r>
-              <w:rPr>
-                <w:rFonts w:ascii="Calibri" w:hAnsi="Calibri" w:cs="Calibri"/>
-                <w:sz w:val="22"/>
-                <w:szCs w:val="22"/>
-              </w:rPr>
-              <w:t>Microsoft.AspNetCore.Components.Endpoints</w:t>
-            </w:r>
-            <w:proofErr w:type="gramEnd"/>
-            <w:r>
-              <w:rPr>
-                <w:rFonts w:ascii="Calibri" w:hAnsi="Calibri" w:cs="Calibri"/>
-                <w:sz w:val="22"/>
-                <w:szCs w:val="22"/>
-              </w:rPr>
-              <w:t>.</w:t>
-            </w:r>
-            <w:proofErr w:type="gramStart"/>
-            <w:r>
-              <w:rPr>
-                <w:rFonts w:ascii="Calibri" w:hAnsi="Calibri" w:cs="Calibri"/>
-                <w:sz w:val="22"/>
-                <w:szCs w:val="22"/>
-              </w:rPr>
-              <w:t>SessionCascadingValueSupplier[</w:t>
-            </w:r>
-            <w:proofErr w:type="gramEnd"/>
-            <w:r>
-              <w:rPr>
-                <w:rFonts w:ascii="Calibri" w:hAnsi="Calibri" w:cs="Calibri"/>
-                <w:sz w:val="22"/>
-                <w:szCs w:val="22"/>
-              </w:rPr>
-              <w:t>2]</w:t>
+              <w:t>warn: Microsoft.AspNetCore.Components.Endpoints.SessionCascadingValueSupplier[2]</w:t>
             </w:r>
           </w:p>
           <w:p>
@@ -2919,7 +2805,6 @@
               <w:t xml:space="preserve">    </w:t>
             </w:r>
             <w:proofErr w:type="spellStart"/>
-            <w:proofErr w:type="gramStart"/>
             <w:r>
               <w:rPr>
                 <w:rFonts w:ascii="Calibri" w:hAnsi="Calibri" w:cs="Calibri"/>
@@ -2929,7 +2814,6 @@
               <w:t>System.Collections.Generic.KeyNotFoundException</w:t>
             </w:r>
             <w:proofErr w:type="spellEnd"/>
-            <w:proofErr w:type="gramEnd"/>
             <w:r>
               <w:rPr>
                 <w:rFonts w:ascii="Calibri" w:hAnsi="Calibri" w:cs="Calibri"/>
@@ -3168,43 +3052,7 @@
                 <w:sz w:val="22"/>
                 <w:szCs w:val="22"/>
               </w:rPr>
-              <w:t xml:space="preserve">warn: </w:t>
-            </w:r>
-            <w:proofErr w:type="gramStart"/>
-            <w:r>
-              <w:rPr>
-                <w:rFonts w:ascii="Calibri" w:hAnsi="Calibri" w:cs="Calibri"/>
-                <w:sz w:val="22"/>
-                <w:szCs w:val="22"/>
-              </w:rPr>
-              <w:t>Microsoft.AspNetCore.Components.Endpoints</w:t>
-            </w:r>
-            <w:proofErr w:type="gramEnd"/>
-            <w:r>
-              <w:rPr>
-                <w:rFonts w:ascii="Calibri" w:hAnsi="Calibri" w:cs="Calibri"/>
-                <w:sz w:val="22"/>
-                <w:szCs w:val="22"/>
-              </w:rPr>
-              <w:t>.</w:t>
-            </w:r>
-            <w:proofErr w:type="gramStart"/>
-            <w:r>
-              <w:rPr>
-                <w:rFonts w:ascii="Calibri" w:hAnsi="Calibri" w:cs="Calibri"/>
-                <w:sz w:val="22"/>
-                <w:szCs w:val="22"/>
-              </w:rPr>
-              <w:t>SessionStorageTempDataProvider[</w:t>
-            </w:r>
-            <w:proofErr w:type="gramEnd"/>
-            <w:r>
-              <w:rPr>
-                <w:rFonts w:ascii="Calibri" w:hAnsi="Calibri" w:cs="Calibri"/>
-                <w:sz w:val="22"/>
-                <w:szCs w:val="22"/>
-              </w:rPr>
-              <w:t>2]</w:t>
+              <w:t>warn: Microsoft.AspNetCore.Components.Endpoints.SessionStorageTempDataProvider[2]</w:t>
             </w:r>
           </w:p>
           <w:p>
@@ -3483,7 +3331,6 @@
               <w:pStyle w:val="NoSpacing"/>
             </w:pPr>
             <w:hyperlink r:id="rId46" w:tooltip="idle-expiry" w:history="1">
-              <w:proofErr w:type="gramStart"/>
               <w:r>
                 <w:rPr>
                   <w:rStyle w:val="Hyperlink"/>
@@ -3493,7 +3340,6 @@
                 </w:rPr>
                 <w:t>idle-expiry</w:t>
               </w:r>
-              <w:proofErr w:type="gramEnd"/>
             </w:hyperlink>
           </w:p>
           <w:p>
@@ -3511,7 +3357,6 @@
               <w:pStyle w:val="NoSpacing"/>
             </w:pPr>
             <w:hyperlink r:id="rId47" w:tooltip="deleted-cookie" w:history="1">
-              <w:proofErr w:type="gramStart"/>
               <w:r>
                 <w:rPr>
                   <w:rStyle w:val="Hyperlink"/>
@@ -3521,7 +3366,6 @@
                 </w:rPr>
                 <w:t>deleted-cookie</w:t>
               </w:r>
-              <w:proofErr w:type="gramEnd"/>
             </w:hyperlink>
           </w:p>
           <w:p>
@@ -3539,7 +3383,6 @@
               <w:pStyle w:val="NoSpacing"/>
             </w:pPr>
             <w:hyperlink r:id="rId48" w:tooltip="corrupt-bytes" w:history="1">
-              <w:proofErr w:type="gramStart"/>
               <w:r>
                 <w:rPr>
                   <w:rStyle w:val="Hyperlink"/>
@@ -3549,7 +3392,6 @@
                 </w:rPr>
                 <w:t>corrupt-bytes</w:t>
               </w:r>
-              <w:proofErr w:type="gramEnd"/>
             </w:hyperlink>
           </w:p>
           <w:p>
@@ -3717,17 +3559,7 @@
           <w:sz w:val="22"/>
           <w:szCs w:val="22"/>
         </w:rPr>
-        <w:t xml:space="preserve">1. </w:t>
-      </w:r>
-      <w:r>
-        <w:rPr>
-          <w:rFonts w:ascii="Calibri" w:hAnsi="Calibri" w:cs="Calibri"/>
-          <w:b/>
-          <w:bCs/>
-          <w:sz w:val="22"/>
-          <w:szCs w:val="22"/>
-        </w:rPr>
-        <w:t>Network-capture friction</w:t>
+        <w:t>1. Network-capture friction</w:t>
       </w:r>
     </w:p>
     <w:p>
@@ -4002,7 +3834,6 @@
         <w:t xml:space="preserve"> </w:t>
       </w:r>
       <w:proofErr w:type="spellStart"/>
-      <w:proofErr w:type="gramStart"/>
       <w:r>
         <w:rPr>
           <w:rFonts w:ascii="Calibri" w:hAnsi="Calibri" w:cs="Calibri"/>
@@ -4012,7 +3843,6 @@
         <w:t>Microsoft.AspNetCore.HttpsPolicy.HttpsRedirectionMiddleware</w:t>
       </w:r>
       <w:proofErr w:type="spellEnd"/>
-      <w:proofErr w:type="gramEnd"/>
       <w:r>
         <w:rPr>
           <w:rFonts w:ascii="Calibri" w:hAnsi="Calibri" w:cs="Calibri"/>
@@ -4069,25 +3899,7 @@
             <w:sz w:val="22"/>
             <w:szCs w:val="22"/>
           </w:rPr>
-          <w:t>idle-expiry</w:t>
-        </w:r>
-        <w:r>
-          <w:rPr>
-            <w:rStyle w:val="Hyperlink"/>
-            <w:rFonts w:ascii="Calibri" w:hAnsi="Calibri" w:cs="Calibri"/>
-            <w:sz w:val="22"/>
-            <w:szCs w:val="22"/>
-          </w:rPr>
-          <w:t>-</w:t>
-        </w:r>
-        <w:r>
-          <w:rPr>
-            <w:rStyle w:val="Hyperlink"/>
-            <w:rFonts w:ascii="Calibri" w:hAnsi="Calibri" w:cs="Calibri"/>
-            <w:sz w:val="22"/>
-            <w:szCs w:val="22"/>
-          </w:rPr>
-          <w:t>session-expiry-log</w:t>
+          <w:t>idle-expiry-session-expiry-log</w:t>
         </w:r>
       </w:hyperlink>
     </w:p>
@@ -4108,16 +3920,7 @@
             <w:sz w:val="22"/>
             <w:szCs w:val="22"/>
           </w:rPr>
-          <w:t>idle-expiry</w:t>
-        </w:r>
-        <w:r>
-          <w:rPr>
-            <w:rStyle w:val="Hyperlink"/>
-            <w:rFonts w:ascii="Calibri" w:hAnsi="Calibri" w:cs="Calibri"/>
-            <w:sz w:val="22"/>
-            <w:szCs w:val="22"/>
-          </w:rPr>
-          <w:t>-</w:t>
+          <w:t>idle-expiry-</w:t>
         </w:r>
         <w:proofErr w:type="spellStart"/>
         <w:r>
@@ -4158,25 +3961,7 @@
             <w:sz w:val="22"/>
             <w:szCs w:val="22"/>
           </w:rPr>
-          <w:t>deleted-cookie</w:t>
-        </w:r>
-        <w:r>
-          <w:rPr>
-            <w:rStyle w:val="Hyperlink"/>
-            <w:rFonts w:ascii="Calibri" w:hAnsi="Calibri" w:cs="Calibri"/>
-            <w:sz w:val="22"/>
-            <w:szCs w:val="22"/>
-          </w:rPr>
-          <w:t>-</w:t>
-        </w:r>
-        <w:r>
-          <w:rPr>
-            <w:rStyle w:val="Hyperlink"/>
-            <w:rFonts w:ascii="Calibri" w:hAnsi="Calibri" w:cs="Calibri"/>
-            <w:sz w:val="22"/>
-            <w:szCs w:val="22"/>
-          </w:rPr>
-          <w:t>session-cookie-log</w:t>
+          <w:t>deleted-cookie-session-cookie-log</w:t>
         </w:r>
       </w:hyperlink>
     </w:p>
@@ -4197,16 +3982,7 @@
             <w:sz w:val="22"/>
             <w:szCs w:val="22"/>
           </w:rPr>
-          <w:t>deleted-cookie</w:t>
-        </w:r>
-        <w:r>
-          <w:rPr>
-            <w:rStyle w:val="Hyperlink"/>
-            <w:rFonts w:ascii="Calibri" w:hAnsi="Calibri" w:cs="Calibri"/>
-            <w:sz w:val="22"/>
-            <w:szCs w:val="22"/>
-          </w:rPr>
-          <w:t>-</w:t>
+          <w:t>deleted-cookie-</w:t>
         </w:r>
         <w:proofErr w:type="spellStart"/>
         <w:r>
@@ -4270,7 +4046,6 @@
         <w:t xml:space="preserve">warn: </w:t>
       </w:r>
       <w:proofErr w:type="spellStart"/>
-      <w:proofErr w:type="gramStart"/>
       <w:r>
         <w:rPr>
           <w:rFonts w:ascii="Calibri" w:hAnsi="Calibri" w:cs="Calibri"/>
@@ -4280,7 +4055,6 @@
         <w:t>Microsoft.AspNetCore.HttpsPolicy.HttpsRedirectionMiddleware</w:t>
       </w:r>
       <w:proofErr w:type="spellEnd"/>
-      <w:proofErr w:type="gramEnd"/>
       <w:r>
         <w:rPr>
           <w:rFonts w:ascii="Calibri" w:hAnsi="Calibri" w:cs="Calibri"/>
@@ -4373,7 +4147,6 @@
           <w:sz w:val="22"/>
           <w:szCs w:val="22"/>
         </w:rPr>
-        <w:lastRenderedPageBreak/>
         <w:t>3</w:t>
       </w:r>
       <w:r>
@@ -4420,25 +4193,7 @@
           <w:sz w:val="22"/>
           <w:szCs w:val="22"/>
         </w:rPr>
-        <w:t xml:space="preserve">no-navigation comparisons retained </w:t>
-      </w:r>
-      <w:proofErr w:type="gramStart"/>
-      <w:r>
-        <w:rPr>
-          <w:rFonts w:ascii="Calibri" w:hAnsi="Calibri" w:cs="Calibri"/>
-          <w:sz w:val="22"/>
-          <w:szCs w:val="22"/>
-        </w:rPr>
-        <w:t>values</w:t>
-      </w:r>
-      <w:proofErr w:type="gramEnd"/>
-      <w:r>
-        <w:rPr>
-          <w:rFonts w:ascii="Calibri" w:hAnsi="Calibri" w:cs="Calibri"/>
-          <w:sz w:val="22"/>
-          <w:szCs w:val="22"/>
-        </w:rPr>
-        <w:t xml:space="preserve"> after the delayed interval represented by the saved artifacts. These comparisons were not used for the official expiry result because the interactive seed event did not establish the required completed write request followed by a separate read request</w:t>
+        <w:t>no-navigation comparisons retained values after the delayed interval represented by the saved artifacts. These comparisons were not used for the official expiry result because the interactive seed event did not establish the required completed write request followed by a separate read request</w:t>
       </w:r>
       <w:r>
         <w:rPr>
@@ -4468,17 +4223,7 @@
           <w:sz w:val="22"/>
           <w:szCs w:val="22"/>
         </w:rPr>
-        <w:t>Evidence</w:t>
-      </w:r>
-      <w:r>
-        <w:rPr>
-          <w:rFonts w:ascii="Calibri" w:hAnsi="Calibri" w:cs="Calibri"/>
-          <w:b/>
-          <w:bCs/>
-          <w:sz w:val="22"/>
-          <w:szCs w:val="22"/>
-        </w:rPr>
-        <w:t>:</w:t>
+        <w:t>Evidence:</w:t>
       </w:r>
     </w:p>
     <w:p>
@@ -4624,27 +4369,7 @@
             <w:sz w:val="22"/>
             <w:szCs w:val="22"/>
           </w:rPr>
-          <w:t>UI-initiated-navigation/tempdata-without-navigation-reload-</w:t>
-        </w:r>
-        <w:proofErr w:type="gramStart"/>
-        <w:r>
-          <w:rPr>
-            <w:rStyle w:val="Hyperlink"/>
-            <w:rFonts w:ascii="Calibri" w:hAnsi="Calibri" w:cs="Calibri"/>
-            <w:sz w:val="22"/>
-            <w:szCs w:val="22"/>
-          </w:rPr>
-          <w:t>after15sec</w:t>
-        </w:r>
-        <w:proofErr w:type="gramEnd"/>
-        <w:r>
-          <w:rPr>
-            <w:rStyle w:val="Hyperlink"/>
-            <w:rFonts w:ascii="Calibri" w:hAnsi="Calibri" w:cs="Calibri"/>
-            <w:sz w:val="22"/>
-            <w:szCs w:val="22"/>
-          </w:rPr>
-          <w:t>-value</w:t>
+          <w:t>UI-initiated-navigation/tempdata-without-navigation-reload-after15sec-value</w:t>
         </w:r>
       </w:hyperlink>
     </w:p>
@@ -4665,27 +4390,7 @@
             <w:sz w:val="22"/>
             <w:szCs w:val="22"/>
           </w:rPr>
-          <w:t>URL-initiated-navigation/tempdata-without-navigation-reload-</w:t>
-        </w:r>
-        <w:proofErr w:type="gramStart"/>
-        <w:r>
-          <w:rPr>
-            <w:rStyle w:val="Hyperlink"/>
-            <w:rFonts w:ascii="Calibri" w:hAnsi="Calibri" w:cs="Calibri"/>
-            <w:sz w:val="22"/>
-            <w:szCs w:val="22"/>
-          </w:rPr>
-          <w:t>after15sec</w:t>
-        </w:r>
-        <w:proofErr w:type="gramEnd"/>
-        <w:r>
-          <w:rPr>
-            <w:rStyle w:val="Hyperlink"/>
-            <w:rFonts w:ascii="Calibri" w:hAnsi="Calibri" w:cs="Calibri"/>
-            <w:sz w:val="22"/>
-            <w:szCs w:val="22"/>
-          </w:rPr>
-          <w:t>-value</w:t>
+          <w:t>URL-initiated-navigation/tempdata-without-navigation-reload-after15sec-value</w:t>
         </w:r>
       </w:hyperlink>
     </w:p>
@@ -5784,6 +5489,7 @@
   <w:style w:type="character" w:default="1" w:styleId="DefaultParagraphFont">
     <w:name w:val="Default Paragraph Font"/>
     <w:uiPriority w:val="1"/>
+    <w:semiHidden/>
     <w:unhideWhenUsed/>
   </w:style>
   <w:style w:type="table" w:default="1" w:styleId="TableNormal">

</xml_diff>